<commit_message>
Rebuild Word manuscript with Contents page
Co-Authored-By: Claude Fable 5 <noreply@anthropic.com>
Claude-Session: https://claude.ai/code/session_01TbuYskKRTmo9dGD48zZruU
</commit_message>
<xml_diff>
--- a/book/Broken Wings - A History of Aviation Crises in Nigeria.docx
+++ b/book/Broken Wings - A History of Aviation Crises in Nigeria.docx
@@ -76,6 +76,364 @@
       </w:r>
       <w:r>
         <w:t xml:space="preserve"> (1983)</w:t>
+      </w:r>
+    </w:p>
+    <w:p>
+      <w:r>
+        <w:br w:type="page"/>
+      </w:r>
+    </w:p>
+    <w:p>
+      <w:pPr>
+        <w:pStyle w:val="Heading1"/>
+      </w:pPr>
+      <w:r>
+        <w:t>Contents</w:t>
+      </w:r>
+    </w:p>
+    <w:p>
+      <w:pPr>
+        <w:spacing w:after="40"/>
+      </w:pPr>
+      <w:r>
+        <w:t>A Note on the Title</w:t>
+      </w:r>
+    </w:p>
+    <w:p>
+      <w:pPr>
+        <w:spacing w:after="40"/>
+      </w:pPr>
+      <w:r>
+        <w:t>Author's Note</w:t>
+      </w:r>
+    </w:p>
+    <w:p>
+      <w:pPr>
+        <w:spacing w:after="40"/>
+      </w:pPr>
+      <w:r>
+        <w:t>On Names and Dignity</w:t>
+      </w:r>
+    </w:p>
+    <w:p>
+      <w:pPr>
+        <w:spacing w:after="40"/>
+      </w:pPr>
+      <w:r>
+        <w:t>Preface — The View from Seat 14A</w:t>
+      </w:r>
+    </w:p>
+    <w:p>
+      <w:pPr>
+        <w:spacing w:after="40"/>
+      </w:pPr>
+      <w:r>
+        <w:t>Introduction — The Instrument Panel of a Nation</w:t>
+      </w:r>
+    </w:p>
+    <w:p>
+      <w:pPr>
+        <w:spacing w:before="160" w:after="40"/>
+      </w:pPr>
+      <w:r>
+        <w:rPr>
+          <w:b/>
+        </w:rPr>
+        <w:t>PART I — THE ASCENT (1925–1990)</w:t>
+      </w:r>
+    </w:p>
+    <w:p>
+      <w:pPr>
+        <w:spacing w:after="40"/>
+        <w:ind w:left="432"/>
+      </w:pPr>
+      <w:r>
+        <w:t>Chapter 1 — Empire's Runways</w:t>
+      </w:r>
+    </w:p>
+    <w:p>
+      <w:pPr>
+        <w:spacing w:after="40"/>
+        <w:ind w:left="432"/>
+      </w:pPr>
+      <w:r>
+        <w:t>Chapter 2 — A Flag in the Sky</w:t>
+      </w:r>
+    </w:p>
+    <w:p>
+      <w:pPr>
+        <w:spacing w:after="40"/>
+        <w:ind w:left="432"/>
+      </w:pPr>
+      <w:r>
+        <w:t>Chapter 3 — The Long Descent Begins</w:t>
+      </w:r>
+    </w:p>
+    <w:p>
+      <w:pPr>
+        <w:spacing w:before="160" w:after="40"/>
+      </w:pPr>
+      <w:r>
+        <w:rPr>
+          <w:b/>
+        </w:rPr>
+        <w:t>PART II — THE CRASHES (1990–2020)</w:t>
+      </w:r>
+    </w:p>
+    <w:p>
+      <w:pPr>
+        <w:spacing w:after="40"/>
+        <w:ind w:left="432"/>
+      </w:pPr>
+      <w:r>
+        <w:t>Chapter 4 — Fire Over Jeddah: Flight 2120</w:t>
+      </w:r>
+    </w:p>
+    <w:p>
+      <w:pPr>
+        <w:spacing w:after="40"/>
+        <w:ind w:left="432"/>
+      </w:pPr>
+      <w:r>
+        <w:t>Chapter 5 — The Lake of Sorrow: The C-130 at Ejigbo</w:t>
+      </w:r>
+    </w:p>
+    <w:p>
+      <w:pPr>
+        <w:spacing w:after="40"/>
+        <w:ind w:left="432"/>
+      </w:pPr>
+      <w:r>
+        <w:t>Chapter 6 — Descent into the Lagoon: ADC 086</w:t>
+      </w:r>
+    </w:p>
+    <w:p>
+      <w:pPr>
+        <w:spacing w:after="40"/>
+        <w:ind w:left="432"/>
+      </w:pPr>
+      <w:r>
+        <w:t>Chapter 7 — Kano, Again: EAS 4226</w:t>
+      </w:r>
+    </w:p>
+    <w:p>
+      <w:pPr>
+        <w:spacing w:after="40"/>
+        <w:ind w:left="432"/>
+      </w:pPr>
+      <w:r>
+        <w:t>Chapter 8 — The Year of Weeping: Bellview 210 and Sosoliso 1145</w:t>
+      </w:r>
+    </w:p>
+    <w:p>
+      <w:pPr>
+        <w:spacing w:after="40"/>
+        <w:ind w:left="432"/>
+      </w:pPr>
+      <w:r>
+        <w:t>Chapter 9 — The Sultan's Last Flight: ADC 053 and the Reform Wave</w:t>
+      </w:r>
+    </w:p>
+    <w:p>
+      <w:pPr>
+        <w:spacing w:after="40"/>
+        <w:ind w:left="432"/>
+      </w:pPr>
+      <w:r>
+        <w:t>Chapter 10 — Dana 992 and the Fragile Peace</w:t>
+      </w:r>
+    </w:p>
+    <w:p>
+      <w:pPr>
+        <w:spacing w:before="160" w:after="40"/>
+      </w:pPr>
+      <w:r>
+        <w:rPr>
+          <w:b/>
+        </w:rPr>
+        <w:t>PART III — THE PATTERNS</w:t>
+      </w:r>
+    </w:p>
+    <w:p>
+      <w:pPr>
+        <w:spacing w:after="40"/>
+        <w:ind w:left="432"/>
+      </w:pPr>
+      <w:r>
+        <w:t>Chapter 11 — The Regulator's Dilemma</w:t>
+      </w:r>
+    </w:p>
+    <w:p>
+      <w:pPr>
+        <w:spacing w:after="40"/>
+        <w:ind w:left="432"/>
+      </w:pPr>
+      <w:r>
+        <w:t>Chapter 12 — The Economics of Cutting Corners</w:t>
+      </w:r>
+    </w:p>
+    <w:p>
+      <w:pPr>
+        <w:spacing w:after="40"/>
+        <w:ind w:left="432"/>
+      </w:pPr>
+      <w:r>
+        <w:t>Chapter 13 — When Help Doesn't Come</w:t>
+      </w:r>
+    </w:p>
+    <w:p>
+      <w:pPr>
+        <w:spacing w:after="40"/>
+        <w:ind w:left="432"/>
+      </w:pPr>
+      <w:r>
+        <w:t>Chapter 14 — The Culture of Silence</w:t>
+      </w:r>
+    </w:p>
+    <w:p>
+      <w:pPr>
+        <w:spacing w:before="160" w:after="40"/>
+      </w:pPr>
+      <w:r>
+        <w:rPr>
+          <w:b/>
+        </w:rPr>
+        <w:t>PART IV — THE FUTURE FLIGHT PATH</w:t>
+      </w:r>
+    </w:p>
+    <w:p>
+      <w:pPr>
+        <w:spacing w:after="40"/>
+        <w:ind w:left="432"/>
+      </w:pPr>
+      <w:r>
+        <w:t>Chapter 15 — Lessons from Elsewhere</w:t>
+      </w:r>
+    </w:p>
+    <w:p>
+      <w:pPr>
+        <w:spacing w:after="40"/>
+        <w:ind w:left="432"/>
+      </w:pPr>
+      <w:r>
+        <w:t>Chapter 16 — Rebuilding Trust</w:t>
+      </w:r>
+    </w:p>
+    <w:p>
+      <w:pPr>
+        <w:spacing w:after="40"/>
+        <w:ind w:left="432"/>
+      </w:pPr>
+      <w:r>
+        <w:t>Chapter 17 — A Nigerian Century in the Air?</w:t>
+      </w:r>
+    </w:p>
+    <w:p>
+      <w:pPr>
+        <w:spacing w:after="40"/>
+        <w:ind w:left="432"/>
+      </w:pPr>
+      <w:r>
+        <w:t>Notes</w:t>
+      </w:r>
+    </w:p>
+    <w:p>
+      <w:pPr>
+        <w:spacing w:after="40"/>
+        <w:ind w:left="432"/>
+      </w:pPr>
+      <w:r>
+        <w:t>Epilogue — The Names</w:t>
+      </w:r>
+    </w:p>
+    <w:p>
+      <w:pPr>
+        <w:spacing w:after="40"/>
+        <w:ind w:left="432"/>
+      </w:pPr>
+      <w:r>
+        <w:t>Appendix A — Timeline of Major Nigerian Aviation Accidents, 1969–2021</w:t>
+      </w:r>
+    </w:p>
+    <w:p>
+      <w:pPr>
+        <w:spacing w:after="40"/>
+        <w:ind w:left="432"/>
+      </w:pPr>
+      <w:r>
+        <w:t>Appendix B — The Institutions</w:t>
+      </w:r>
+    </w:p>
+    <w:p>
+      <w:pPr>
+        <w:spacing w:after="40"/>
+        <w:ind w:left="432"/>
+      </w:pPr>
+      <w:r>
+        <w:t>Appendix C — Glossary and Abbreviations</w:t>
+      </w:r>
+    </w:p>
+    <w:p>
+      <w:pPr>
+        <w:spacing w:after="40"/>
+        <w:ind w:left="432"/>
+      </w:pPr>
+      <w:r>
+        <w:t>A Note on Sources</w:t>
+      </w:r>
+    </w:p>
+    <w:p>
+      <w:pPr>
+        <w:spacing w:after="40"/>
+        <w:ind w:left="432"/>
+      </w:pPr>
+      <w:r>
+        <w:t>Appendix D — The Publication Ledger</w:t>
+      </w:r>
+    </w:p>
+    <w:p>
+      <w:pPr>
+        <w:spacing w:after="40"/>
+        <w:ind w:left="432"/>
+      </w:pPr>
+      <w:r>
+        <w:t>Appendix E — Institutional Milestones, 1919–2024</w:t>
+      </w:r>
+    </w:p>
+    <w:p>
+      <w:pPr>
+        <w:spacing w:after="40"/>
+        <w:ind w:left="432"/>
+      </w:pPr>
+      <w:r>
+        <w:t>Appendix F — A Teaching Guide</w:t>
+      </w:r>
+    </w:p>
+    <w:p>
+      <w:pPr>
+        <w:spacing w:after="40"/>
+        <w:ind w:left="432"/>
+      </w:pPr>
+      <w:r>
+        <w:t>A Bibliographic Essay: Reading Further</w:t>
+      </w:r>
+    </w:p>
+    <w:p>
+      <w:pPr>
+        <w:spacing w:after="40"/>
+        <w:ind w:left="432"/>
+      </w:pPr>
+      <w:r>
+        <w:t>Acknowledgments</w:t>
+      </w:r>
+    </w:p>
+    <w:p>
+      <w:pPr>
+        <w:spacing w:after="40"/>
+        <w:ind w:left="432"/>
+      </w:pPr>
+      <w:r>
+        <w:t>Index</w:t>
       </w:r>
     </w:p>
     <w:p>

</xml_diff>

<commit_message>
Build full alphabetized glossary (Appendix C, ~80 entries); rebuild Word manuscript
Co-Authored-By: Claude Fable 5 <noreply@anthropic.com>
Claude-Session: https://claude.ai/code/session_01TbuYskKRTmo9dGD48zZruU
</commit_message>
<xml_diff>
--- a/book/Broken Wings - A History of Aviation Crises in Nigeria.docx
+++ b/book/Broken Wings - A History of Aviation Crises in Nigeria.docx
@@ -12122,16 +12122,24 @@
     </w:p>
     <w:p>
       <w:pPr>
+        <w:jc w:val="both"/>
+      </w:pPr>
+      <w:r>
+        <w:t>Every term of art used in this book, in plain English, alphabetized. Chapter references point to the fullest discussion. Institutional names (NCAA, NSIB, FAAN, etc.) are covered separately in Appendix B.</w:t>
+      </w:r>
+    </w:p>
+    <w:p>
+      <w:pPr>
         <w:pStyle w:val="ListBullet"/>
       </w:pPr>
       <w:r>
         <w:rPr>
           <w:b/>
         </w:rPr>
-        <w:t>AOC</w:t>
-      </w:r>
-      <w:r>
-        <w:t xml:space="preserve"> — Air Operator Certificate; an airline's license to operate.</w:t>
+        <w:t>AIB</w:t>
+      </w:r>
+      <w:r>
+        <w:t xml:space="preserve"> — Accident Investigation Bureau, Nigeria's independent civil accident investigator from 2006 until its 2022 reconstitution as the NSIB (see Appendix B).</w:t>
       </w:r>
     </w:p>
     <w:p>
@@ -12142,10 +12150,10 @@
         <w:rPr>
           <w:b/>
         </w:rPr>
-        <w:t>ARFF</w:t>
-      </w:r>
-      <w:r>
-        <w:t xml:space="preserve"> — Aircraft Rescue and Firefighting; airport fire service.</w:t>
+        <w:t>Airworthiness</w:t>
+      </w:r>
+      <w:r>
+        <w:t xml:space="preserve"> — The condition of an aircraft conforming to its approved design and being safe for flight; maintained by inspection and certified maintenance, and attested by a certificate of airworthiness on the national registry.</w:t>
       </w:r>
     </w:p>
     <w:p>
@@ -12156,10 +12164,60 @@
         <w:rPr>
           <w:b/>
         </w:rPr>
+        <w:t>Airworthiness directive (AD)</w:t>
+      </w:r>
+      <w:r>
+        <w:t xml:space="preserve"> — A regulator's mandatory order requiring inspection, repair, or modification of an aircraft type after a safety deficiency is identified.</w:t>
+      </w:r>
+    </w:p>
+    <w:p>
+      <w:pPr>
+        <w:pStyle w:val="ListBullet"/>
+      </w:pPr>
+      <w:r>
+        <w:rPr>
+          <w:b/>
+        </w:rPr>
+        <w:t>Annex (to the Chicago Convention)</w:t>
+      </w:r>
+      <w:r>
+        <w:t xml:space="preserve"> — One of the nineteen technical rulebooks attached to the 1944 treaty. This book leans on </w:t>
+      </w:r>
+      <w:r>
+        <w:rPr>
+          <w:b/>
+        </w:rPr>
+        <w:t>Annex 6</w:t>
+      </w:r>
+      <w:r>
+        <w:t xml:space="preserve"> (aircraft operations, including lease oversight), </w:t>
+      </w:r>
+      <w:r>
+        <w:rPr>
+          <w:b/>
+        </w:rPr>
         <w:t>Annex 13</w:t>
       </w:r>
       <w:r>
-        <w:t xml:space="preserve"> — Chicago Convention annex governing accident investigation; mandates independence and prevention-only purpose.</w:t>
+        <w:t xml:space="preserve"> (accident investigation: independent, public, for prevention "not to apportion blame or liability"), </w:t>
+      </w:r>
+      <w:r>
+        <w:rPr>
+          <w:b/>
+        </w:rPr>
+        <w:t>Annex 14</w:t>
+      </w:r>
+      <w:r>
+        <w:t xml:space="preserve"> (aerodromes, including rescue and firefighting standards), and </w:t>
+      </w:r>
+      <w:r>
+        <w:rPr>
+          <w:b/>
+        </w:rPr>
+        <w:t>Annex 19</w:t>
+      </w:r>
+      <w:r>
+        <w:t xml:space="preserve"> (safety management and the protection of safety information).</w:t>
       </w:r>
     </w:p>
     <w:p>
@@ -12170,10 +12228,10 @@
         <w:rPr>
           <w:b/>
         </w:rPr>
-        <w:t>Annex 14</w:t>
-      </w:r>
-      <w:r>
-        <w:t xml:space="preserve"> — Annex governing aerodromes, including ARFF standards.</w:t>
+        <w:t>AOC — Air Operator Certificate</w:t>
+      </w:r>
+      <w:r>
+        <w:t xml:space="preserve"> — The state's license authorizing a company to operate commercial air transport; the document at stake in the 2006–07 re-certification purge (Chapter 9).</w:t>
       </w:r>
     </w:p>
     <w:p>
@@ -12184,10 +12242,10 @@
         <w:rPr>
           <w:b/>
         </w:rPr>
-        <w:t>C-check</w:t>
-      </w:r>
-      <w:r>
-        <w:t xml:space="preserve"> — Major scheduled maintenance inspection, weeks-long.</w:t>
+        <w:t>AOG — Aircraft on ground</w:t>
+      </w:r>
+      <w:r>
+        <w:t xml:space="preserve"> — Industry shorthand for an aircraft grounded awaiting parts or repair; the costliest routine emergency in airline operations (Chapter 12).</w:t>
       </w:r>
     </w:p>
     <w:p>
@@ -12198,10 +12256,429 @@
         <w:rPr>
           <w:b/>
         </w:rPr>
-        <w:t>Category 1 / 2 (IASA)</w:t>
-      </w:r>
-      <w:r>
-        <w:t xml:space="preserve"> — FAA rating of a </w:t>
+        <w:t>ARFF — Aircraft rescue and firefighting</w:t>
+      </w:r>
+      <w:r>
+        <w:t xml:space="preserve"> — The airport fire service. ICAO categories specify vehicles, water and foam quantities, and a response time of about three minutes to any point of the runway (Chapters 8, 13).</w:t>
+      </w:r>
+    </w:p>
+    <w:p>
+      <w:pPr>
+        <w:pStyle w:val="ListBullet"/>
+      </w:pPr>
+      <w:r>
+        <w:rPr>
+          <w:b/>
+        </w:rPr>
+        <w:t>ATC — Air traffic control</w:t>
+      </w:r>
+      <w:r>
+        <w:t xml:space="preserve"> — The ground service that separates aircraft. </w:t>
+      </w:r>
+      <w:r>
+        <w:rPr>
+          <w:b/>
+        </w:rPr>
+        <w:t>Procedural control</w:t>
+      </w:r>
+      <w:r>
+        <w:t xml:space="preserve"> is ATC without radar: separation built from pilots' position reports, timing, and altitude rules — the method in use over Lagos in 1996 (Chapter 6).</w:t>
+      </w:r>
+    </w:p>
+    <w:p>
+      <w:pPr>
+        <w:pStyle w:val="ListBullet"/>
+      </w:pPr>
+      <w:r>
+        <w:rPr>
+          <w:b/>
+        </w:rPr>
+        <w:t>Bilateral air services agreement (BASA)</w:t>
+      </w:r>
+      <w:r>
+        <w:t xml:space="preserve"> — The state-to-state treaty allocating routes, capacity, and landing rights between two countries' airlines (Chapters 2, 17).</w:t>
+      </w:r>
+    </w:p>
+    <w:p>
+      <w:pPr>
+        <w:pStyle w:val="ListBullet"/>
+      </w:pPr>
+      <w:r>
+        <w:rPr>
+          <w:b/>
+        </w:rPr>
+        <w:t>Black boxes</w:t>
+      </w:r>
+      <w:r>
+        <w:t xml:space="preserve"> — see CVR and FDR.</w:t>
+      </w:r>
+    </w:p>
+    <w:p>
+      <w:pPr>
+        <w:pStyle w:val="ListBullet"/>
+      </w:pPr>
+      <w:r>
+        <w:rPr>
+          <w:b/>
+        </w:rPr>
+        <w:t>C-check / D-check</w:t>
+      </w:r>
+      <w:r>
+        <w:t xml:space="preserve"> — The heavy tiers of an airliner's scheduled maintenance program: deep, weeks-long structural and systems inspections in which airworthiness actually lives (Chapter 12).</w:t>
+      </w:r>
+    </w:p>
+    <w:p>
+      <w:pPr>
+        <w:pStyle w:val="ListBullet"/>
+      </w:pPr>
+      <w:r>
+        <w:rPr>
+          <w:b/>
+        </w:rPr>
+        <w:t>Cannibalization</w:t>
+      </w:r>
+      <w:r>
+        <w:t xml:space="preserve"> — Removing serviceable parts from one aircraft to keep another flying; legitimate under tight control, and a symptom of collapse as a way of life (Chapter 3).</w:t>
+      </w:r>
+    </w:p>
+    <w:p>
+      <w:pPr>
+        <w:pStyle w:val="ListBullet"/>
+      </w:pPr>
+      <w:r>
+        <w:rPr>
+          <w:b/>
+        </w:rPr>
+        <w:t>Cape Town Convention (2001)</w:t>
+      </w:r>
+      <w:r>
+        <w:t xml:space="preserve"> — The treaty giving aircraft financiers fast, reliable cross-border repossession rights; compliance lowers a country's cost of financing new aircraft (Chapters 12, 16).</w:t>
+      </w:r>
+    </w:p>
+    <w:p>
+      <w:pPr>
+        <w:pStyle w:val="ListBullet"/>
+      </w:pPr>
+      <w:r>
+        <w:rPr>
+          <w:b/>
+        </w:rPr>
+        <w:t>Category 1 / Category 2</w:t>
+      </w:r>
+      <w:r>
+        <w:t xml:space="preserve"> — see IASA.</w:t>
+      </w:r>
+    </w:p>
+    <w:p>
+      <w:pPr>
+        <w:pStyle w:val="ListBullet"/>
+      </w:pPr>
+      <w:r>
+        <w:rPr>
+          <w:b/>
+        </w:rPr>
+        <w:t>Charter</w:t>
+      </w:r>
+      <w:r>
+        <w:t xml:space="preserve"> — A flight sold as a whole to one customer (a Hajj board, a company, a family) rather than seat-by-seat on a schedule; historically the least-supervised corner of Nigerian aviation (Chapters 2, 4, 10).</w:t>
+      </w:r>
+    </w:p>
+    <w:p>
+      <w:pPr>
+        <w:pStyle w:val="ListBullet"/>
+      </w:pPr>
+      <w:r>
+        <w:rPr>
+          <w:b/>
+        </w:rPr>
+        <w:t>Chicago Convention (1944)</w:t>
+      </w:r>
+      <w:r>
+        <w:t xml:space="preserve"> — The founding treaty of international civil aviation, establishing state sovereignty over airspace, national registries, and the ICAO system.</w:t>
+      </w:r>
+    </w:p>
+    <w:p>
+      <w:pPr>
+        <w:pStyle w:val="ListBullet"/>
+      </w:pPr>
+      <w:r>
+        <w:rPr>
+          <w:b/>
+        </w:rPr>
+        <w:t>CVR — Cockpit voice recorder</w:t>
+      </w:r>
+      <w:r>
+        <w:t xml:space="preserve"> — The crash-protected recorder of cockpit sound; its legal protection from routine prosecutorial use is part of the just-culture bargain (Chapter 14).</w:t>
+      </w:r>
+    </w:p>
+    <w:p>
+      <w:pPr>
+        <w:pStyle w:val="ListBullet"/>
+      </w:pPr>
+      <w:r>
+        <w:rPr>
+          <w:b/>
+        </w:rPr>
+        <w:t>Density altitude</w:t>
+      </w:r>
+      <w:r>
+        <w:t xml:space="preserve"> — The altitude at which the standard atmosphere would match the day's actual air density. Heat thins air; a hot afternoon at Kano makes an aircraft perform as if departing a mountain airfield (Chapter 7).</w:t>
+      </w:r>
+    </w:p>
+    <w:p>
+      <w:pPr>
+        <w:pStyle w:val="ListBullet"/>
+      </w:pPr>
+      <w:r>
+        <w:rPr>
+          <w:b/>
+        </w:rPr>
+        <w:t>Dispatch</w:t>
+      </w:r>
+      <w:r>
+        <w:t xml:space="preserve"> — The ground function that releases a flight: weather, fuel, weight, aircraft status, and legality, decided before the cabin door closes. </w:t>
+      </w:r>
+      <w:r>
+        <w:rPr>
+          <w:b/>
+        </w:rPr>
+        <w:t>Dispatch pressure</w:t>
+      </w:r>
+      <w:r>
+        <w:t xml:space="preserve"> is the commercial force that leans on that decision (Chapters 4, 9).</w:t>
+      </w:r>
+    </w:p>
+    <w:p>
+      <w:pPr>
+        <w:pStyle w:val="ListBullet"/>
+      </w:pPr>
+      <w:r>
+        <w:rPr>
+          <w:b/>
+        </w:rPr>
+        <w:t>Downburst / microburst</w:t>
+      </w:r>
+      <w:r>
+        <w:t xml:space="preserve"> — A column of storm-cooled air collapsing to the ground and splashing outward; its concentrated form, the microburst, creates the low-altitude windshear trap that destroyed Sosoliso 1145 and ADC 053 (Chapters 8, 9).</w:t>
+      </w:r>
+    </w:p>
+    <w:p>
+      <w:pPr>
+        <w:pStyle w:val="ListBullet"/>
+      </w:pPr>
+      <w:r>
+        <w:rPr>
+          <w:b/>
+        </w:rPr>
+        <w:t>Dry lease</w:t>
+      </w:r>
+      <w:r>
+        <w:t xml:space="preserve"> — Renting an aircraft alone, without crew; the lessee operates it under its own certificate (contrast wet lease).</w:t>
+      </w:r>
+    </w:p>
+    <w:p>
+      <w:pPr>
+        <w:pStyle w:val="ListBullet"/>
+      </w:pPr>
+      <w:r>
+        <w:rPr>
+          <w:b/>
+        </w:rPr>
+        <w:t>EASA</w:t>
+      </w:r>
+      <w:r>
+        <w:t xml:space="preserve"> — The European Union Aviation Safety Agency, Europe's joint regulator.</w:t>
+      </w:r>
+    </w:p>
+    <w:p>
+      <w:pPr>
+        <w:pStyle w:val="ListBullet"/>
+      </w:pPr>
+      <w:r>
+        <w:rPr>
+          <w:b/>
+        </w:rPr>
+        <w:t>EU Air Safety List</w:t>
+      </w:r>
+      <w:r>
+        <w:t xml:space="preserve"> — The European Union's published ban list of airlines and states whose oversight it does not trust; exile to and exit from it bracket the Indonesian and Angolan cases (Chapter 15).</w:t>
+      </w:r>
+    </w:p>
+    <w:p>
+      <w:pPr>
+        <w:pStyle w:val="ListBullet"/>
+      </w:pPr>
+      <w:r>
+        <w:rPr>
+          <w:b/>
+        </w:rPr>
+        <w:t>FAA</w:t>
+      </w:r>
+      <w:r>
+        <w:t xml:space="preserve"> — The United States Federal Aviation Administration.</w:t>
+      </w:r>
+    </w:p>
+    <w:p>
+      <w:pPr>
+        <w:pStyle w:val="ListBullet"/>
+      </w:pPr>
+      <w:r>
+        <w:rPr>
+          <w:b/>
+        </w:rPr>
+        <w:t>FDR — Flight data recorder</w:t>
+      </w:r>
+      <w:r>
+        <w:t xml:space="preserve"> — The crash-protected recorder of flight parameters; with the CVR, the primary forensic witness to any accident. </w:t>
+      </w:r>
+      <w:r>
+        <w:rPr>
+          <w:b/>
+        </w:rPr>
+        <w:t>Readout</w:t>
+      </w:r>
+      <w:r>
+        <w:t xml:space="preserve"> requires specialized laboratories (Chapters 8, 10).</w:t>
+      </w:r>
+    </w:p>
+    <w:p>
+      <w:pPr>
+        <w:pStyle w:val="ListBullet"/>
+      </w:pPr>
+      <w:r>
+        <w:rPr>
+          <w:b/>
+        </w:rPr>
+        <w:t>Ferry flight</w:t>
+      </w:r>
+      <w:r>
+        <w:t xml:space="preserve"> — A non-revenue repositioning flight, often to deliver an aircraft to a buyer or maintenance base.</w:t>
+      </w:r>
+    </w:p>
+    <w:p>
+      <w:pPr>
+        <w:pStyle w:val="ListBullet"/>
+      </w:pPr>
+      <w:r>
+        <w:rPr>
+          <w:b/>
+        </w:rPr>
+        <w:t>Fifth freedom</w:t>
+      </w:r>
+      <w:r>
+        <w:t xml:space="preserve"> — The right of an airline to carry traffic between two foreign countries on a route from home; the contested heart of African open-skies negotiations (Chapter 17).</w:t>
+      </w:r>
+    </w:p>
+    <w:p>
+      <w:pPr>
+        <w:pStyle w:val="ListBullet"/>
+      </w:pPr>
+      <w:r>
+        <w:rPr>
+          <w:b/>
+        </w:rPr>
+        <w:t>Flag carrier</w:t>
+      </w:r>
+      <w:r>
+        <w:t xml:space="preserve"> — A state-owned or state-identified national airline; this book's Chapter 2 and its recurring cautionary object.</w:t>
+      </w:r>
+    </w:p>
+    <w:p>
+      <w:pPr>
+        <w:pStyle w:val="ListBullet"/>
+      </w:pPr>
+      <w:r>
+        <w:rPr>
+          <w:b/>
+        </w:rPr>
+        <w:t>Flight data monitoring (FDM)</w:t>
+      </w:r>
+      <w:r>
+        <w:t xml:space="preserve"> — An airline's routine download and analysis of its own flights' data to catch hazards before they become accidents; runs on negotiated no-punishment protections (Chapter 14).</w:t>
+      </w:r>
+    </w:p>
+    <w:p>
+      <w:pPr>
+        <w:pStyle w:val="ListBullet"/>
+      </w:pPr>
+      <w:r>
+        <w:rPr>
+          <w:b/>
+        </w:rPr>
+        <w:t>Go-around</w:t>
+      </w:r>
+      <w:r>
+        <w:t xml:space="preserve"> — Abandoning an approach to climb away and retry, divert, or hold; modern doctrine makes it mandatory at defined stabilized-approach gates and treats it as the system working, never as failure (Chapter 8).</w:t>
+      </w:r>
+    </w:p>
+    <w:p>
+      <w:pPr>
+        <w:pStyle w:val="ListBullet"/>
+      </w:pPr>
+      <w:r>
+        <w:rPr>
+          <w:b/>
+        </w:rPr>
+        <w:t>Golden hour</w:t>
+      </w:r>
+      <w:r>
+        <w:t xml:space="preserve"> — Trauma medicine's shorthand for the early post-injury window in which intervention saves the most lives; the calibration behind response-time standards (Chapter 13).</w:t>
+      </w:r>
+    </w:p>
+    <w:p>
+      <w:pPr>
+        <w:pStyle w:val="ListBullet"/>
+      </w:pPr>
+      <w:r>
+        <w:rPr>
+          <w:b/>
+        </w:rPr>
+        <w:t>GPWS / EGPWS</w:t>
+      </w:r>
+      <w:r>
+        <w:t xml:space="preserve"> — Ground-proximity warning systems, the cockpit technology that warns of terrain; the enhanced version arrived a generation after the fleets of Chapter 6 were built.</w:t>
+      </w:r>
+    </w:p>
+    <w:p>
+      <w:pPr>
+        <w:pStyle w:val="ListBullet"/>
+      </w:pPr>
+      <w:r>
+        <w:rPr>
+          <w:b/>
+        </w:rPr>
+        <w:t>Ground effect</w:t>
+      </w:r>
+      <w:r>
+        <w:t xml:space="preserve"> — The cushion of improved lift very close to the ground; an aircraft that cannot climb may still stagger along in it, as EAS 4226 did across Gwammaja (Chapter 7).</w:t>
+      </w:r>
+    </w:p>
+    <w:p>
+      <w:pPr>
+        <w:pStyle w:val="ListBullet"/>
+      </w:pPr>
+      <w:r>
+        <w:rPr>
+          <w:b/>
+        </w:rPr>
+        <w:t>Hull loss</w:t>
+      </w:r>
+      <w:r>
+        <w:t xml:space="preserve"> — Industry term for an accident that destroys the aircraft.</w:t>
+      </w:r>
+    </w:p>
+    <w:p>
+      <w:pPr>
+        <w:pStyle w:val="ListBullet"/>
+      </w:pPr>
+      <w:r>
+        <w:rPr>
+          <w:b/>
+        </w:rPr>
+        <w:t>IASA — International Aviation Safety Assessment</w:t>
+      </w:r>
+      <w:r>
+        <w:t xml:space="preserve"> — The FAA's audit of a </w:t>
       </w:r>
       <w:r>
         <w:rPr>
@@ -12210,7 +12687,25 @@
         <w:t>country's</w:t>
       </w:r>
       <w:r>
-        <w:t xml:space="preserve"> oversight (not its airlines); Category 1 permits direct US service.</w:t>
+        <w:t xml:space="preserve"> oversight system, not of its airlines. </w:t>
+      </w:r>
+      <w:r>
+        <w:rPr>
+          <w:b/>
+        </w:rPr>
+        <w:t>Category 1</w:t>
+      </w:r>
+      <w:r>
+        <w:t xml:space="preserve"> (meets ICAO standards) permits that country's carriers to serve the United States; </w:t>
+      </w:r>
+      <w:r>
+        <w:rPr>
+          <w:b/>
+        </w:rPr>
+        <w:t>Category 2</w:t>
+      </w:r>
+      <w:r>
+        <w:t xml:space="preserve"> does not. Nigeria attained Category 1 in August 2010 (Chapter 9).</w:t>
       </w:r>
     </w:p>
     <w:p>
@@ -12221,10 +12716,10 @@
         <w:rPr>
           <w:b/>
         </w:rPr>
-        <w:t>CVR / FDR</w:t>
-      </w:r>
-      <w:r>
-        <w:t xml:space="preserve"> — Cockpit voice recorder / flight data recorder ("black boxes").</w:t>
+        <w:t>IATA</w:t>
+      </w:r>
+      <w:r>
+        <w:t xml:space="preserve"> — The International Air Transport Association, the airlines' global trade body.</w:t>
       </w:r>
     </w:p>
     <w:p>
@@ -12235,10 +12730,10 @@
         <w:rPr>
           <w:b/>
         </w:rPr>
-        <w:t>Density altitude</w:t>
-      </w:r>
-      <w:r>
-        <w:t xml:space="preserve"> — Effective altitude for aircraft performance; high heat = thin air = degraded performance.</w:t>
+        <w:t>ICAO</w:t>
+      </w:r>
+      <w:r>
+        <w:t xml:space="preserve"> — The International Civil Aviation Organization, the UN agency in Montreal that maintains the Chicago system's standards and audits states' compliance.</w:t>
       </w:r>
     </w:p>
     <w:p>
@@ -12249,10 +12744,10 @@
         <w:rPr>
           <w:b/>
         </w:rPr>
-        <w:t>EU Air Safety List</w:t>
-      </w:r>
-      <w:r>
-        <w:t xml:space="preserve"> — The European ban list of carriers/states.</w:t>
+        <w:t>ILS — Instrument landing system</w:t>
+      </w:r>
+      <w:r>
+        <w:t xml:space="preserve"> — The ground-based radio guidance that lets aircraft descend to a runway in poor visibility.</w:t>
       </w:r>
     </w:p>
     <w:p>
@@ -12263,10 +12758,10 @@
         <w:rPr>
           <w:b/>
         </w:rPr>
-        <w:t>IOSA</w:t>
-      </w:r>
-      <w:r>
-        <w:t xml:space="preserve"> — IATA Operational Safety Audit of airlines.</w:t>
+        <w:t>IOSA — IATA Operational Safety Audit</w:t>
+      </w:r>
+      <w:r>
+        <w:t xml:space="preserve"> — The airline-level international audit; made a condition of Nigerian scheduled operation in the reform era (Chapter 9).</w:t>
       </w:r>
     </w:p>
     <w:p>
@@ -12280,7 +12775,7 @@
         <w:t>Just culture</w:t>
       </w:r>
       <w:r>
-        <w:t xml:space="preserve"> — The bargain protecting honest error reports from punishment to keep safety information flowing.</w:t>
+        <w:t xml:space="preserve"> — The institutional bargain in which frontline professionals trade candor about errors and hazards for protection from punishment, keeping safety information flowing; the foundation of modern aviation safety (Chapter 14).</w:t>
       </w:r>
     </w:p>
     <w:p>
@@ -12291,10 +12786,10 @@
         <w:rPr>
           <w:b/>
         </w:rPr>
-        <w:t>SAATM</w:t>
-      </w:r>
-      <w:r>
-        <w:t xml:space="preserve"> — Single African Air Transport Market (AU open-skies).</w:t>
+        <w:t>Load sheet / weight and balance</w:t>
+      </w:r>
+      <w:r>
+        <w:t xml:space="preserve"> — The computation certifying that an aircraft's weight and its distribution are within limits; soft weight culture is a recurring finding of this book (Chapter 7).</w:t>
       </w:r>
     </w:p>
     <w:p>
@@ -12305,10 +12800,243 @@
         <w:rPr>
           <w:b/>
         </w:rPr>
+        <w:t>Manifest</w:t>
+      </w:r>
+      <w:r>
+        <w:t xml:space="preserve"> — The definitive list of persons aboard a flight; its unreliability in the crisis decades turned every Nigerian disaster into an identification crisis (Chapters 3, 4, 8).</w:t>
+      </w:r>
+    </w:p>
+    <w:p>
+      <w:pPr>
+        <w:pStyle w:val="ListBullet"/>
+      </w:pPr>
+      <w:r>
+        <w:rPr>
+          <w:b/>
+        </w:rPr>
+        <w:t>MEL — Minimum equipment list</w:t>
+      </w:r>
+      <w:r>
+        <w:t xml:space="preserve"> — The approved list of what may legally be inoperative at dispatch, and for how long; the lawful channel for deferring defects (Chapters 4, 12).</w:t>
+      </w:r>
+    </w:p>
+    <w:p>
+      <w:pPr>
+        <w:pStyle w:val="ListBullet"/>
+      </w:pPr>
+      <w:r>
+        <w:rPr>
+          <w:b/>
+        </w:rPr>
+        <w:t>Micromort</w:t>
+      </w:r>
+      <w:r>
+        <w:t xml:space="preserve"> — A one-in-a-million probability of death; the unit in which transport risk premia are usefully imagined (Chapter 12).</w:t>
+      </w:r>
+    </w:p>
+    <w:p>
+      <w:pPr>
+        <w:pStyle w:val="ListBullet"/>
+      </w:pPr>
+      <w:r>
+        <w:rPr>
+          <w:b/>
+        </w:rPr>
+        <w:t>Montreal Convention (1999)</w:t>
+      </w:r>
+      <w:r>
+        <w:t xml:space="preserve"> — The modern treaty governing airline liability to passengers, replacing the Warsaw regime's low caps (Chapters 4, 10).</w:t>
+      </w:r>
+    </w:p>
+    <w:p>
+      <w:pPr>
+        <w:pStyle w:val="ListBullet"/>
+      </w:pPr>
+      <w:r>
+        <w:rPr>
+          <w:b/>
+        </w:rPr>
+        <w:t>MRO — Maintenance, repair, and overhaul</w:t>
+      </w:r>
+      <w:r>
+        <w:t xml:space="preserve"> — The heavy- maintenance industry; Nigeria's absent storey of the aviation stack (Chapter 12).</w:t>
+      </w:r>
+    </w:p>
+    <w:p>
+      <w:pPr>
+        <w:pStyle w:val="ListBullet"/>
+      </w:pPr>
+      <w:r>
+        <w:rPr>
+          <w:b/>
+        </w:rPr>
+        <w:t>Normalization of deviance</w:t>
+      </w:r>
+      <w:r>
+        <w:t xml:space="preserve"> — Diane Vaughan's term for the drift by which each survived shortcut becomes evidence the next one is safe (Chapter 4).</w:t>
+      </w:r>
+    </w:p>
+    <w:p>
+      <w:pPr>
+        <w:pStyle w:val="ListBullet"/>
+      </w:pPr>
+      <w:r>
+        <w:rPr>
+          <w:b/>
+        </w:rPr>
+        <w:t>NOTAM</w:t>
+      </w:r>
+      <w:r>
+        <w:t xml:space="preserve"> — Notice to airmen: the official channel publishing the operational status of airports, airspace, and navigation aids.</w:t>
+      </w:r>
+    </w:p>
+    <w:p>
+      <w:pPr>
+        <w:pStyle w:val="ListBullet"/>
+      </w:pPr>
+      <w:r>
+        <w:rPr>
+          <w:b/>
+        </w:rPr>
+        <w:t>NTSB</w:t>
+      </w:r>
+      <w:r>
+        <w:t xml:space="preserve"> — The US National Transportation Safety Board, the world's reference independent accident investigator and the model for the NSIB (Chapters 10, 14).</w:t>
+      </w:r>
+    </w:p>
+    <w:p>
+      <w:pPr>
+        <w:pStyle w:val="ListBullet"/>
+      </w:pPr>
+      <w:r>
+        <w:rPr>
+          <w:b/>
+        </w:rPr>
+        <w:t>Obstacle limitation surfaces / public safety zones</w:t>
+      </w:r>
+      <w:r>
+        <w:t xml:space="preserve"> — The planning controls that keep construction and settlement out of the approach and climb funnels at runway ends; unenforced at Kano in 2002 (Chapter 7).</w:t>
+      </w:r>
+    </w:p>
+    <w:p>
+      <w:pPr>
+        <w:pStyle w:val="ListBullet"/>
+      </w:pPr>
+      <w:r>
+        <w:rPr>
+          <w:b/>
+        </w:rPr>
+        <w:t>Plan-continuation bias</w:t>
+      </w:r>
+      <w:r>
+        <w:t xml:space="preserve"> — The decision pathology of deepening commitment to a plan as evidence mounts against it, strongest near the plan's completion — the psychology of the continued approach (Chapter 8).</w:t>
+      </w:r>
+    </w:p>
+    <w:p>
+      <w:pPr>
+        <w:pStyle w:val="ListBullet"/>
+      </w:pPr>
+      <w:r>
+        <w:rPr>
+          <w:b/>
+        </w:rPr>
+        <w:t>Procedural control</w:t>
+      </w:r>
+      <w:r>
+        <w:t xml:space="preserve"> — see ATC.</w:t>
+      </w:r>
+    </w:p>
+    <w:p>
+      <w:pPr>
+        <w:pStyle w:val="ListBullet"/>
+      </w:pPr>
+      <w:r>
+        <w:rPr>
+          <w:b/>
+        </w:rPr>
+        <w:t>Ramp check</w:t>
+      </w:r>
+      <w:r>
+        <w:t xml:space="preserve"> — An unannounced inspection of an aircraft between flights; </w:t>
+      </w:r>
+      <w:r>
+        <w:rPr>
+          <w:b/>
+        </w:rPr>
+        <w:t>SAFA</w:t>
+      </w:r>
+      <w:r>
+        <w:t xml:space="preserve"> is the EU's program of ramp checks on foreign aircraft (Chapters 4, 11).</w:t>
+      </w:r>
+    </w:p>
+    <w:p>
+      <w:pPr>
+        <w:pStyle w:val="ListBullet"/>
+      </w:pPr>
+      <w:r>
+        <w:rPr>
+          <w:b/>
+        </w:rPr>
+        <w:t>Recorder, crash-survivable</w:t>
+      </w:r>
+      <w:r>
+        <w:t xml:space="preserve"> — see CVR, FDR; certified to survive defined impact, fire, and immersion — an envelope the Bellview impact exceeded (Chapter 8).</w:t>
+      </w:r>
+    </w:p>
+    <w:p>
+      <w:pPr>
+        <w:pStyle w:val="ListBullet"/>
+      </w:pPr>
+      <w:r>
+        <w:rPr>
+          <w:b/>
+        </w:rPr>
+        <w:t>Registry / registration</w:t>
+      </w:r>
+      <w:r>
+        <w:t xml:space="preserve"> — The national list on which every aircraft is entered (Nigerian registrations begin 5N-); the state of registry owes the aircraft its safety oversight, the gap wet leases exploit (Chapter 4).</w:t>
+      </w:r>
+    </w:p>
+    <w:p>
+      <w:pPr>
+        <w:pStyle w:val="ListBullet"/>
+      </w:pPr>
+      <w:r>
+        <w:rPr>
+          <w:b/>
+        </w:rPr>
+        <w:t>Rome Convention framework</w:t>
+      </w:r>
+      <w:r>
+        <w:t xml:space="preserve"> — The treaty line governing liability to people harmed on the ground by aircraft (Chapter 7).</w:t>
+      </w:r>
+    </w:p>
+    <w:p>
+      <w:pPr>
+        <w:pStyle w:val="ListBullet"/>
+      </w:pPr>
+      <w:r>
+        <w:rPr>
+          <w:b/>
+        </w:rPr>
+        <w:t>SAATM — Single African Air Transport Market</w:t>
+      </w:r>
+      <w:r>
+        <w:t xml:space="preserve"> — The African Union's open-skies project, operationalizing the 1999 Yamoussoukro Decision (Chapters 16, 17).</w:t>
+      </w:r>
+    </w:p>
+    <w:p>
+      <w:pPr>
+        <w:pStyle w:val="ListBullet"/>
+      </w:pPr>
+      <w:r>
+        <w:rPr>
+          <w:b/>
+        </w:rPr>
         <w:t>SARPs</w:t>
       </w:r>
       <w:r>
-        <w:t xml:space="preserve"> — ICAO Standards and Recommended Practices.</w:t>
+        <w:t xml:space="preserve"> — ICAO's Standards and Recommended Practices, the content of the Annexes.</w:t>
       </w:r>
     </w:p>
     <w:p>
@@ -12319,10 +13047,10 @@
         <w:rPr>
           <w:b/>
         </w:rPr>
-        <w:t>SMS</w:t>
-      </w:r>
-      <w:r>
-        <w:t xml:space="preserve"> — Safety Management System; an operator's formal risk machinery.</w:t>
+        <w:t>SMS — Safety management system</w:t>
+      </w:r>
+      <w:r>
+        <w:t xml:space="preserve"> — An operator's or agency's formal machinery for identifying, assessing, and controlling risk; required of modern operators under Annex 19.</w:t>
       </w:r>
     </w:p>
     <w:p>
@@ -12333,10 +13061,10 @@
         <w:rPr>
           <w:b/>
         </w:rPr>
-        <w:t>TRACON</w:t>
-      </w:r>
-      <w:r>
-        <w:t xml:space="preserve"> — Total Radar Coverage of Nigeria (commissioned 2010).</w:t>
+        <w:t>Spatial disorientation</w:t>
+      </w:r>
+      <w:r>
+        <w:t xml:space="preserve"> — The systematic deception of the human balance senses in flight without visual horizon; the physiology of the graveyard spiral and of ADC 086's final seconds (Chapter 6).</w:t>
       </w:r>
     </w:p>
     <w:p>
@@ -12347,10 +13075,10 @@
         <w:rPr>
           <w:b/>
         </w:rPr>
-        <w:t>USOAP</w:t>
-      </w:r>
-      <w:r>
-        <w:t xml:space="preserve"> — ICAO's Universal Safety Oversight Audit Programme.</w:t>
+        <w:t>Squall line</w:t>
+      </w:r>
+      <w:r>
+        <w:t xml:space="preserve"> — West Africa's organized walls of thunderstorms, moving east to west on the seasonal monsoon contest; the recurring meteorological antagonist of Part II (Chapter 9).</w:t>
       </w:r>
     </w:p>
     <w:p>
@@ -12361,28 +13089,159 @@
         <w:rPr>
           <w:b/>
         </w:rPr>
+        <w:t>Stabilized approach</w:t>
+      </w:r>
+      <w:r>
+        <w:t xml:space="preserve"> — The doctrine defining speed, configuration, and descent gates on final approach; any deviation mandates a go-around, no diagnosis permitted (Chapter 8).</w:t>
+      </w:r>
+    </w:p>
+    <w:p>
+      <w:pPr>
+        <w:pStyle w:val="ListBullet"/>
+      </w:pPr>
+      <w:r>
+        <w:rPr>
+          <w:b/>
+        </w:rPr>
+        <w:t>Swiss cheese model</w:t>
+      </w:r>
+      <w:r>
+        <w:t xml:space="preserve"> — James Reason's image of accident causation: every defensive layer has holes, and disaster occurs when the holes align (Introduction).</w:t>
+      </w:r>
+    </w:p>
+    <w:p>
+      <w:pPr>
+        <w:pStyle w:val="ListBullet"/>
+      </w:pPr>
+      <w:r>
+        <w:rPr>
+          <w:b/>
+        </w:rPr>
+        <w:t>TCAS — Traffic collision avoidance system</w:t>
+      </w:r>
+      <w:r>
+        <w:t xml:space="preserve"> — The onboard system that detects conflicting aircraft and commands evasive climbs and descents; absent from the fleets of 1996 (Chapter 6).</w:t>
+      </w:r>
+    </w:p>
+    <w:p>
+      <w:pPr>
+        <w:pStyle w:val="ListBullet"/>
+      </w:pPr>
+      <w:r>
+        <w:rPr>
+          <w:b/>
+        </w:rPr>
+        <w:t>TDWR — Terminal Doppler weather radar</w:t>
+      </w:r>
+      <w:r>
+        <w:t xml:space="preserve"> — Airport radar designed to detect windshear and microbursts; the technology the post-1985 American reforms installed and Abuja 2006 lacked (Chapter 9).</w:t>
+      </w:r>
+    </w:p>
+    <w:p>
+      <w:pPr>
+        <w:pStyle w:val="ListBullet"/>
+      </w:pPr>
+      <w:r>
+        <w:rPr>
+          <w:b/>
+        </w:rPr>
+        <w:t>TRACON — Total Radar Coverage of Nigeria</w:t>
+      </w:r>
+      <w:r>
+        <w:t xml:space="preserve"> — The national radar project commissioned in 2010, fourteen years after the lagoon (Chapter 6).</w:t>
+      </w:r>
+    </w:p>
+    <w:p>
+      <w:pPr>
+        <w:pStyle w:val="ListBullet"/>
+      </w:pPr>
+      <w:r>
+        <w:rPr>
+          <w:b/>
+        </w:rPr>
+        <w:t>Type rating</w:t>
+      </w:r>
+      <w:r>
+        <w:t xml:space="preserve"> — The specific license qualification to fly a particular aircraft type.</w:t>
+      </w:r>
+    </w:p>
+    <w:p>
+      <w:pPr>
+        <w:pStyle w:val="ListBullet"/>
+      </w:pPr>
+      <w:r>
+        <w:rPr>
+          <w:b/>
+        </w:rPr>
+        <w:t>Upset / upset recovery training</w:t>
+      </w:r>
+      <w:r>
+        <w:t xml:space="preserve"> — Loss of normal flight attitude, and the modern simulator training for recognizing and recovering from it; standardized globally only after the era of Chapter 6's accident.</w:t>
+      </w:r>
+    </w:p>
+    <w:p>
+      <w:pPr>
+        <w:pStyle w:val="ListBullet"/>
+      </w:pPr>
+      <w:r>
+        <w:rPr>
+          <w:b/>
+        </w:rPr>
+        <w:t>USOAP — Universal Safety Oversight Audit Programme</w:t>
+      </w:r>
+      <w:r>
+        <w:t xml:space="preserve"> — ICAO's audit of states' oversight systems; its </w:t>
+      </w:r>
+      <w:r>
+        <w:rPr>
+          <w:b/>
+        </w:rPr>
+        <w:t>effective implementation (EI) score</w:t>
+      </w:r>
+      <w:r>
+        <w:t xml:space="preserve"> is the percentage of the oversight function that actually exists (Chapters 11, 15).</w:t>
+      </w:r>
+    </w:p>
+    <w:p>
+      <w:pPr>
+        <w:pStyle w:val="ListBullet"/>
+      </w:pPr>
+      <w:r>
+        <w:rPr>
+          <w:b/>
+        </w:rPr>
+        <w:t>Warsaw Convention (1929)</w:t>
+      </w:r>
+      <w:r>
+        <w:t xml:space="preserve"> — The old airline-liability treaty whose low per-passenger caps shaped the settlements of Chapter 4; superseded by Montreal 1999.</w:t>
+      </w:r>
+    </w:p>
+    <w:p>
+      <w:pPr>
+        <w:pStyle w:val="ListBullet"/>
+      </w:pPr>
+      <w:r>
+        <w:rPr>
+          <w:b/>
+        </w:rPr>
         <w:t>Wet lease</w:t>
       </w:r>
       <w:r>
-        <w:t xml:space="preserve"> — Renting aircraft </w:t>
-      </w:r>
-      <w:r>
-        <w:rPr>
-          <w:i/>
-        </w:rPr>
-        <w:t>with</w:t>
-      </w:r>
-      <w:r>
-        <w:t xml:space="preserve"> crew/maintenance/insurance (vs. </w:t>
-      </w:r>
+        <w:t xml:space="preserve"> — Renting an aircraft together with its crew, maintenance, and insurance, so the aircraft flies under one company's flag while answering operationally to another's — the arrangement at the heart of Flight 2120 (Chapter 4).</w:t>
+      </w:r>
+    </w:p>
+    <w:p>
+      <w:pPr>
+        <w:pStyle w:val="ListBullet"/>
+      </w:pPr>
       <w:r>
         <w:rPr>
           <w:b/>
         </w:rPr>
-        <w:t>dry lease</w:t>
-      </w:r>
-      <w:r>
-        <w:t>, aircraft only).</w:t>
+        <w:t>Windshear</w:t>
+      </w:r>
+      <w:r>
+        <w:t xml:space="preserve"> — An abrupt change of wind speed or direction over a short distance; encountered at low altitude it strips lift faster than engines can restore it (Chapters 8, 9).</w:t>
       </w:r>
     </w:p>
     <w:p>
@@ -12393,10 +13252,10 @@
         <w:rPr>
           <w:b/>
         </w:rPr>
-        <w:t>Windshear</w:t>
-      </w:r>
-      <w:r>
-        <w:t xml:space="preserve"> — Abrupt wind change with altitude/position; lethal near the ground; thunderstorm signature.</w:t>
+        <w:t>Wreckage-site custody</w:t>
+      </w:r>
+      <w:r>
+        <w:t xml:space="preserve"> — The evidence-preservation discipline at a crash site; its failure at Lisa village helped defeat the Bellview investigation (Chapter 8).</w:t>
       </w:r>
     </w:p>
     <w:p>
@@ -12407,210 +13266,10 @@
         <w:rPr>
           <w:b/>
         </w:rPr>
-        <w:t>AOG</w:t>
-      </w:r>
-      <w:r>
-        <w:t xml:space="preserve"> — Aircraft on ground: unflyable pending parts/repair; the industry's costliest routine emergency.</w:t>
-      </w:r>
-    </w:p>
-    <w:p>
-      <w:pPr>
-        <w:pStyle w:val="ListBullet"/>
-      </w:pPr>
-      <w:r>
-        <w:rPr>
-          <w:b/>
-        </w:rPr>
-        <w:t>ATC</w:t>
-      </w:r>
-      <w:r>
-        <w:t xml:space="preserve"> — Air traffic control. </w:t>
-      </w:r>
-      <w:r>
-        <w:rPr>
-          <w:b/>
-        </w:rPr>
-        <w:t>Procedural control</w:t>
-      </w:r>
-      <w:r>
-        <w:t xml:space="preserve"> — separation by position reports and timing, without radar surveillance.</w:t>
-      </w:r>
-    </w:p>
-    <w:p>
-      <w:pPr>
-        <w:pStyle w:val="ListBullet"/>
-      </w:pPr>
-      <w:r>
-        <w:rPr>
-          <w:b/>
-        </w:rPr>
-        <w:t>Density altitude</w:t>
-      </w:r>
-      <w:r>
-        <w:t xml:space="preserve"> — see Chapter 7; the performance-effective altitude after temperature correction.</w:t>
-      </w:r>
-    </w:p>
-    <w:p>
-      <w:pPr>
-        <w:pStyle w:val="ListBullet"/>
-      </w:pPr>
-      <w:r>
-        <w:rPr>
-          <w:b/>
-        </w:rPr>
-        <w:t>FDR / CVR readout</w:t>
-      </w:r>
-      <w:r>
-        <w:t xml:space="preserve"> — laboratory recovery of recorder data; requires specialized facilities (see Chapters 8, 10).</w:t>
-      </w:r>
-    </w:p>
-    <w:p>
-      <w:pPr>
-        <w:pStyle w:val="ListBullet"/>
-      </w:pPr>
-      <w:r>
-        <w:rPr>
-          <w:b/>
-        </w:rPr>
-        <w:t>Go-around</w:t>
-      </w:r>
-      <w:r>
-        <w:t xml:space="preserve"> — Abandoning an approach to climb and retry or divert; mandated at defined "stabilized approach" gates.</w:t>
-      </w:r>
-    </w:p>
-    <w:p>
-      <w:pPr>
-        <w:pStyle w:val="ListBullet"/>
-      </w:pPr>
-      <w:r>
-        <w:rPr>
-          <w:b/>
-        </w:rPr>
-        <w:t>IASA</w:t>
-      </w:r>
-      <w:r>
-        <w:t xml:space="preserve"> — see Category 1/2. </w:t>
-      </w:r>
-      <w:r>
-        <w:rPr>
-          <w:b/>
-        </w:rPr>
-        <w:t>USOAP EI score</w:t>
-      </w:r>
-      <w:r>
-        <w:t xml:space="preserve"> — ICAO's "effective implementation" percentage for a state's oversight.</w:t>
-      </w:r>
-    </w:p>
-    <w:p>
-      <w:pPr>
-        <w:pStyle w:val="ListBullet"/>
-      </w:pPr>
-      <w:r>
-        <w:rPr>
-          <w:b/>
-        </w:rPr>
-        <w:t>MEL</w:t>
-      </w:r>
-      <w:r>
-        <w:t xml:space="preserve"> — Minimum equipment list: what may legally be inoperative for dispatch, and for how long.</w:t>
-      </w:r>
-    </w:p>
-    <w:p>
-      <w:pPr>
-        <w:pStyle w:val="ListBullet"/>
-      </w:pPr>
-      <w:r>
-        <w:rPr>
-          <w:b/>
-        </w:rPr>
-        <w:t>Microburst / downburst</w:t>
-      </w:r>
-      <w:r>
-        <w:t xml:space="preserve"> — concentrated storm downdraft; the windshear mechanism in Chapters 8–9.</w:t>
-      </w:r>
-    </w:p>
-    <w:p>
-      <w:pPr>
-        <w:pStyle w:val="ListBullet"/>
-      </w:pPr>
-      <w:r>
-        <w:rPr>
-          <w:b/>
-        </w:rPr>
-        <w:t>MRO</w:t>
-      </w:r>
-      <w:r>
-        <w:t xml:space="preserve"> — Maintenance, repair, and overhaul (organization or industry).</w:t>
-      </w:r>
-    </w:p>
-    <w:p>
-      <w:pPr>
-        <w:pStyle w:val="ListBullet"/>
-      </w:pPr>
-      <w:r>
-        <w:rPr>
-          <w:b/>
-        </w:rPr>
-        <w:t>Plan-continuation bias</w:t>
-      </w:r>
-      <w:r>
-        <w:t xml:space="preserve"> — the decision pathology of pressing on as evidence accumulates against the plan (Chapter 8).</w:t>
-      </w:r>
-    </w:p>
-    <w:p>
-      <w:pPr>
-        <w:pStyle w:val="ListBullet"/>
-      </w:pPr>
-      <w:r>
-        <w:rPr>
-          <w:b/>
-        </w:rPr>
-        <w:t>Ramp check / SAFA</w:t>
-      </w:r>
-      <w:r>
-        <w:t xml:space="preserve"> — unannounced inspection of a visiting foreign aircraft; the EU's programme of the same.</w:t>
-      </w:r>
-    </w:p>
-    <w:p>
-      <w:pPr>
-        <w:pStyle w:val="ListBullet"/>
-      </w:pPr>
-      <w:r>
-        <w:rPr>
-          <w:b/>
-        </w:rPr>
-        <w:t>Stabilized approach</w:t>
-      </w:r>
-      <w:r>
-        <w:t xml:space="preserve"> — defined speed/configuration/descent gates on final; deviation mandates go-around.</w:t>
-      </w:r>
-    </w:p>
-    <w:p>
-      <w:pPr>
-        <w:pStyle w:val="ListBullet"/>
-      </w:pPr>
-      <w:r>
-        <w:rPr>
-          <w:b/>
-        </w:rPr>
-        <w:t>Swiss cheese model</w:t>
-      </w:r>
-      <w:r>
-        <w:t xml:space="preserve"> — Reason's image of layered defenses whose aligned holes admit the accident (Introduction).</w:t>
-      </w:r>
-    </w:p>
-    <w:p>
-      <w:pPr>
-        <w:pStyle w:val="ListBullet"/>
-      </w:pPr>
-      <w:r>
-        <w:rPr>
-          <w:b/>
-        </w:rPr>
-        <w:t>Wreckage-site custody</w:t>
-      </w:r>
-      <w:r>
-        <w:t xml:space="preserve"> — evidence-preservation discipline at a crash site; its failure at Lisa cost the Bellview investigation (Chapter 8).</w:t>
+        <w:t>Yamoussoukro Decision (1999)</w:t>
+      </w:r>
+      <w:r>
+        <w:t xml:space="preserve"> — The African agreement to liberalize intra-African air transport, parent of SAATM (Chapter 17).</w:t>
       </w:r>
     </w:p>
     <w:p>

</xml_diff>